<commit_message>
docs: contratos Auth/Pagos v1.4 y Pagos/Entradas v2.4 vigente
- Auth/Pagos v1.4 alineado con el contrato general de Auth v1.1 (x-api-key por ambiente, auth-service:10000, sin SLA, errores con código). La v1.3 pasa a historial.
- Pagos/Entradas v2.4 deja de ser borrador, referencia Auth v1.4 y documenta la ruta actual de Entradas en el Docker integrado.
</commit_message>
<xml_diff>
--- a/docs/contratos/Contrato_Pagos_Entradas_v2.4.docx
+++ b/docs/contratos/Contrato_Pagos_Entradas_v2.4.docx
@@ -23,7 +23,7 @@
         <w:t xml:space="preserve">Versión:</w:t>
       </w:r>
       <w:r>
-        <w:t xml:space="preserve"> 2.4 (API v1) — 28/10/2026. Borrador para revisión del equipo Pagos. Alinea el contrato con el código actual del módulo (versión 2.8.0) y con la guía del Platform Team (API Gateway y RabbitMQ): Pagos publica el resultado del cobro en el broker (RabbitMQ), acepta la ruta del API Gateway, recibe el código de descuento e informa a quién se emite la entrada (sección 10).</w:t>
+        <w:t xml:space="preserve"> 2.4 (API v1) — 28/10/2026. Alinea el contrato con el código actual del módulo (versión 2.8.0) y con la guía del Platform Team (API Gateway y RabbitMQ): Pagos publica el resultado del cobro en el broker (RabbitMQ), acepta la ruta del API Gateway, recibe el código de descuento e informa a quién se emite la entrada (sección 10).</w:t>
       </w:r>
     </w:p>
     <w:p>
@@ -68,7 +68,7 @@
         <w:t xml:space="preserve">Basado en:</w:t>
       </w:r>
       <w:r>
-        <w:t xml:space="preserve"> Contrato Entradas → Pagos v2.0 "Flujo asíncrono" (Sebastián Fuentes); HU 1.1, HU 1.3 (#4), HU 1.6 (#8), HU 3.1 (#16) y HU 3.3 (#18); ítems de integración INT-01 (#29), INT-02 (#30) e INT-03 (#31); tabla de dependencias TITEC 2026-2 (fila Pagos); Swagger docs/openapi.yaml, tag "Entradas (consumidor)"; contrato Auth/Pagos v1.3; contrato Promociones/Pagos v1.0; guía del Platform Team (API Gateway y RabbitMQ).</w:t>
+        <w:t xml:space="preserve"> Contrato Entradas → Pagos v2.0 "Flujo asíncrono" (Sebastián Fuentes); HU 1.1, HU 1.3 (#4), HU 1.6 (#8), HU 3.1 (#16) y HU 3.3 (#18); ítems de integración INT-01 (#29), INT-02 (#30) e INT-03 (#31); tabla de dependencias TITEC 2026-2 (fila Pagos); Swagger docs/openapi.yaml, tag "Entradas (consumidor)"; contrato Auth/Pagos v1.4; contrato Promociones/Pagos v1.0; guía del Platform Team (API Gateway y RabbitMQ).</w:t>
       </w:r>
     </w:p>
     <w:bookmarkStart w:id="20" w:name="X6352f894868301d82383a985a0c00be2af4d86a"/>
@@ -6115,7 +6115,7 @@
         <w:t xml:space="preserve">Nota de diseño:</w:t>
       </w:r>
       <w:r>
-        <w:t xml:space="preserve"> Si Entradas responde 404, Pagos responde 422 RESERVA_NO_ENCONTRADA. Si no responde en 500 ms o falla, Pagos responde 503 ENTRADAS_NO_DISPONIBLE y no crea el pago. Mientras Entradas no exponga esta ruta, Pagos trabaja con la verificación desactivada (ENTRADAS_MODO=mock) y confía en el body recibido. La ruta usa el prefijo /api/entradas que exige el API Gateway del Platform Team (el Gateway no reescribe el path, así que la ruta /api/v1/entradas/... que proponía la v2.3 no pasaría por él). Si Entradas usa otra ruta bajo /api/entradas, se cambia por configuración (ENTRADAS_RUTA_RESERVA) sin tocar el código.</w:t>
+        <w:t xml:space="preserve"> Si Entradas responde 404, Pagos responde 422 RESERVA_NO_ENCONTRADA. Si no responde en 500 ms o falla, Pagos responde 503 ENTRADAS_NO_DISPONIBLE y no crea el pago. Hoy Entradas expone esta consulta en GET /api/v1/entradas/reservas/{id_reserva} y entrega total y cantidad_entradas con estos mismos nombres. En el Docker integrado, Pagos la llama directo a entradas-service con ENTRADAS_MODO=http y ENTRADAS_RUTA_RESERVA=/api/v1/entradas/reservas/{id_reserva}, hasta que Entradas la publique bajo /api/entradas. Con ENTRADAS_MODO=mock la verificación queda desactivada y Pagos confía en el body recibido (solo para desarrollo). La ruta usa el prefijo /api/entradas que exige el API Gateway del Platform Team (el Gateway no reescribe el path, así que la ruta /api/v1/entradas/... que proponía la v2.3 no pasaría por él). Si Entradas usa otra ruta bajo /api/entradas, se cambia por configuración (ENTRADAS_RUTA_RESERVA) sin tocar el código.</w:t>
       </w:r>
     </w:p>
     <w:bookmarkEnd w:id="59"/>
@@ -6720,6 +6720,18 @@
       </w:pPr>
       <w:r>
         <w:t xml:space="preserve">Errores de Auth según su contrato general v1.1: si Auth responde 500, Pagos responde 500; si responde 503, no contesta a tiempo o no hay conexión, Pagos responde 503 AUTH_NO_DISPONIBLE.</w:t>
+      </w:r>
+    </w:p>
+    <w:p>
+      <w:pPr>
+        <w:numPr>
+          <w:ilvl w:val="0"/>
+          <w:numId w:val="1003"/>
+        </w:numPr>
+        <w:pStyle w:val="Compact"/>
+      </w:pPr>
+      <w:r>
+        <w:t xml:space="preserve">Se referencia el contrato Auth/Pagos v1.4 (alineado con el contrato general de Auth v1.1) y se documenta cómo Pagos consulta hoy la reserva en Entradas en el Docker integrado (operación 6).</w:t>
       </w:r>
     </w:p>
     <w:p>

</xml_diff>

<commit_message>
chore: Docker integrado con Entradas y RabbitMQ activados por defecto
- docker-compose: ENTRADAS_MODO=http y BROKER_MODO=rabbitmq por defecto (se pueden apagar con *_DOCKER en el .env).
- .env.example: la x-api-key es la misma de auth-service y entradas-service; se quita la ruta /api/v1/entradas.
- Contrato Entradas v2.4: Entradas ya expone GET /api/entradas/reservas/{id_reserva}.
</commit_message>
<xml_diff>
--- a/docs/contratos/Contrato_Pagos_Entradas_v2.4.docx
+++ b/docs/contratos/Contrato_Pagos_Entradas_v2.4.docx
@@ -6115,7 +6115,7 @@
         <w:t xml:space="preserve">Nota de diseño:</w:t>
       </w:r>
       <w:r>
-        <w:t xml:space="preserve"> Si Entradas responde 404, Pagos responde 422 RESERVA_NO_ENCONTRADA. Si no responde en 500 ms o falla, Pagos responde 503 ENTRADAS_NO_DISPONIBLE y no crea el pago. Hoy Entradas expone esta consulta en GET /api/v1/entradas/reservas/{id_reserva} y entrega total y cantidad_entradas con estos mismos nombres. En el Docker integrado, Pagos la llama directo a entradas-service con ENTRADAS_MODO=http y ENTRADAS_RUTA_RESERVA=/api/v1/entradas/reservas/{id_reserva}, hasta que Entradas la publique bajo /api/entradas. Con ENTRADAS_MODO=mock la verificación queda desactivada y Pagos confía en el body recibido (solo para desarrollo). La ruta usa el prefijo /api/entradas que exige el API Gateway del Platform Team (el Gateway no reescribe el path, así que la ruta /api/v1/entradas/... que proponía la v2.3 no pasaría por él). Si Entradas usa otra ruta bajo /api/entradas, se cambia por configuración (ENTRADAS_RUTA_RESERVA) sin tocar el código.</w:t>
+        <w:t xml:space="preserve"> Si Entradas responde 404, Pagos responde 422 RESERVA_NO_ENCONTRADA. Si no responde en 500 ms o falla, Pagos responde 503 ENTRADAS_NO_DISPONIBLE y no crea el pago. Entradas expone esta consulta en GET /api/entradas/reservas/{id_reserva} y entrega total y cantidad_entradas con estos mismos nombres. En el Docker integrado, Pagos la llama directo a http://entradas-service:3000 con ENTRADAS_MODO=http, que es el valor por defecto de su docker-compose. Con ENTRADAS_MODO=mock la verificación queda desactivada y Pagos confía en el body recibido (solo para desarrollo). La ruta usa el prefijo /api/entradas que exige el API Gateway del Platform Team (el Gateway no reescribe el path, así que la ruta /api/v1/entradas/... que proponía la v2.3 no pasaría por él). Si Entradas usa otra ruta bajo /api/entradas, se cambia por configuración (ENTRADAS_RUTA_RESERVA) sin tocar el código.</w:t>
       </w:r>
     </w:p>
     <w:bookmarkEnd w:id="59"/>
@@ -6807,7 +6807,7 @@
         <w:pStyle w:val="Compact"/>
       </w:pPr>
       <w:r>
-        <w:t xml:space="preserve">☐ Ruta y respuesta del servicio de reservas de Entradas (operación 6): confirmar GET /api/entradas/reservas/{id_reserva} y si informa nombre_codigo. Hoy Entradas expone GET /api/v1/entradas/reservas/{id_reserva}; mientras lo ajusta, Pagos lo llama directo por la red Docker configurando ENTRADAS_RUTA_RESERVA, sin cambiar código.</w:t>
+        <w:t xml:space="preserve">☐ Respuesta del servicio de reservas de Entradas (operación 6): Entradas ya expone GET /api/entradas/reservas/{id_reserva}; falta confirmar si informa nombre_codigo.</w:t>
       </w:r>
     </w:p>
     <w:p>

</xml_diff>